<commit_message>
Update README and Setup Guide for auto-publish feature
- README: merged Step 1+2 (consumer tests now auto-publish),
  renumbered steps, updated project structure to show conftest.py,
  added 3 new troubleshooting rows for auto-publish scenarios
- Python_Pact_Setup_Guide.docx: same changes reflected in the
  Word document — Step 8 now covers both test + auto-publish,
  removed separate publish step, updated project tree and
  troubleshooting table

Co-Authored-By: Claude Sonnet 4.6 <noreply@anthropic.com>
</commit_message>
<xml_diff>
--- a/Python_Pact_Setup_Guide.docx
+++ b/Python_Pact_Setup_Guide.docx
@@ -790,7 +790,7 @@
         <w:spacing w:after="60" w:before="60"/>
         <w:ind w:left="360"/>
       </w:pPr>
-      <w:hyperlink w:history="1" r:id="rIdzzksfimzi9ymrgoamqmmp">
+      <w:hyperlink w:history="1" r:id="rIdmsvvn76y6qd_r3lpgadpl">
         <w:r>
           <w:rPr>
             <w:rStyle w:val="Hyperlink"/>
@@ -945,7 +945,7 @@
         <w:spacing w:after="60" w:before="60"/>
         <w:ind w:left="360"/>
       </w:pPr>
-      <w:hyperlink w:history="1" r:id="rIdpty2rnpwylxrfcbwfnh-o">
+      <w:hyperlink w:history="1" r:id="rIde-dhw8fzp2js_cut8qqmx">
         <w:r>
           <w:rPr>
             <w:rStyle w:val="Hyperlink"/>
@@ -1037,7 +1037,7 @@
         <w:spacing w:after="60" w:before="60"/>
         <w:ind w:left="360"/>
       </w:pPr>
-      <w:hyperlink w:history="1" r:id="rIdmnqcp1xfdvjm7zjoqmxov">
+      <w:hyperlink w:history="1" r:id="rIduhh5xnhtmk9bipr8tpukp">
         <w:r>
           <w:rPr>
             <w:rStyle w:val="Hyperlink"/>
@@ -1360,7 +1360,23 @@
           <w:sz w:val="20"/>
           <w:szCs w:val="20"/>
         </w:rPr>
-        <w:t xml:space="preserve">│   │   └── test_pact_consumer.py   # Defines contract + consumer tests</w:t>
+        <w:t xml:space="preserve">│   │   ├── conftest.py             # Auto-publishes contract to PactFlow after tests pass</w:t>
+      </w:r>
+    </w:p>
+    <w:p>
+      <w:pPr>
+        <w:shd w:fill="F2F2F2" w:val="clear"/>
+        <w:spacing w:after="40" w:before="40"/>
+        <w:ind w:left="360"/>
+      </w:pPr>
+      <w:r>
+        <w:rPr>
+          <w:rFonts w:ascii="Courier New" w:cs="Courier New" w:eastAsia="Courier New" w:hAnsi="Courier New"/>
+          <w:color w:val="1E1E1E"/>
+          <w:sz w:val="20"/>
+          <w:szCs w:val="20"/>
+        </w:rPr>
+        <w:t xml:space="preserve">│   │   └── test_pact_consumer.py  # Defines contract + consumer tests</w:t>
       </w:r>
     </w:p>
     <w:p>
@@ -1392,7 +1408,7 @@
           <w:sz w:val="20"/>
           <w:szCs w:val="20"/>
         </w:rPr>
-        <w:t xml:space="preserve">│       └── test_pact_provider.py   # Verifies provider against contract</w:t>
+        <w:t xml:space="preserve">│       └── test_pact_provider.py  # Verifies provider against contract</w:t>
       </w:r>
     </w:p>
     <w:p>
@@ -1424,7 +1440,7 @@
           <w:sz w:val="20"/>
           <w:szCs w:val="20"/>
         </w:rPr>
-        <w:t xml:space="preserve">│   └── publish_pact.py     # Publishes contract to PactFlow</w:t>
+        <w:t xml:space="preserve">│   └── publish_pact.py     # Manual publish fallback (optional)</w:t>
       </w:r>
     </w:p>
     <w:p>
@@ -4055,7 +4071,7 @@
                 <w:sz w:val="28"/>
                 <w:szCs w:val="28"/>
               </w:rPr>
-              <w:t xml:space="preserve">Run Consumer Tests  (Generates the Contract)</w:t>
+              <w:t xml:space="preserve">Run Consumer Tests  (Auto-publishes Contract to PactFlow)</w:t>
             </w:r>
           </w:p>
         </w:tc>
@@ -4094,6 +4110,24 @@
           <w:sz w:val="22"/>
           <w:szCs w:val="22"/>
         </w:rPr>
+        <w:t xml:space="preserve">After all tests pass, the contract is automatically published to PactFlow — no separate publish command needed.</w:t>
+      </w:r>
+    </w:p>
+    <w:p>
+      <w:pPr>
+        <w:spacing w:after="60" w:before="60"/>
+      </w:pPr>
+    </w:p>
+    <w:p>
+      <w:pPr>
+        <w:spacing w:after="80" w:before="80"/>
+      </w:pPr>
+      <w:r>
+        <w:rPr>
+          <w:rFonts w:ascii="Arial" w:cs="Arial" w:eastAsia="Arial" w:hAnsi="Arial"/>
+          <w:sz w:val="22"/>
+          <w:szCs w:val="22"/>
+        </w:rPr>
         <w:t xml:space="preserve">Run from the project root (virtual env must be activated):</w:t>
       </w:r>
     </w:p>
@@ -4192,6 +4226,22 @@
           <w:sz w:val="20"/>
           <w:szCs w:val="20"/>
         </w:rPr>
+        <w:t xml:space="preserve">3 passed</w:t>
+      </w:r>
+    </w:p>
+    <w:p>
+      <w:pPr>
+        <w:shd w:fill="F2F2F2" w:val="clear"/>
+        <w:spacing w:after="40" w:before="40"/>
+        <w:ind w:left="360"/>
+      </w:pPr>
+      <w:r>
+        <w:rPr>
+          <w:rFonts w:ascii="Courier New" w:cs="Courier New" w:eastAsia="Courier New" w:hAnsi="Courier New"/>
+          <w:color w:val="1E1E1E"/>
+          <w:sz w:val="20"/>
+          <w:szCs w:val="20"/>
+        </w:rPr>
         <w:t xml:space="preserve"/>
       </w:r>
     </w:p>
@@ -4208,7 +4258,87 @@
           <w:sz w:val="20"/>
           <w:szCs w:val="20"/>
         </w:rPr>
-        <w:t xml:space="preserve">3 passed</w:t>
+        <w:t xml:space="preserve">[PactFlow] Auto-publishing contract...</w:t>
+      </w:r>
+    </w:p>
+    <w:p>
+      <w:pPr>
+        <w:shd w:fill="F2F2F2" w:val="clear"/>
+        <w:spacing w:after="40" w:before="40"/>
+        <w:ind w:left="360"/>
+      </w:pPr>
+      <w:r>
+        <w:rPr>
+          <w:rFonts w:ascii="Courier New" w:cs="Courier New" w:eastAsia="Courier New" w:hAnsi="Courier New"/>
+          <w:color w:val="1E1E1E"/>
+          <w:sz w:val="20"/>
+          <w:szCs w:val="20"/>
+        </w:rPr>
+        <w:t xml:space="preserve">  Consumer : BooksCatalogue</w:t>
+      </w:r>
+    </w:p>
+    <w:p>
+      <w:pPr>
+        <w:shd w:fill="F2F2F2" w:val="clear"/>
+        <w:spacing w:after="40" w:before="40"/>
+        <w:ind w:left="360"/>
+      </w:pPr>
+      <w:r>
+        <w:rPr>
+          <w:rFonts w:ascii="Courier New" w:cs="Courier New" w:eastAsia="Courier New" w:hAnsi="Courier New"/>
+          <w:color w:val="1E1E1E"/>
+          <w:sz w:val="20"/>
+          <w:szCs w:val="20"/>
+        </w:rPr>
+        <w:t xml:space="preserve">  Provider : CoursesCatalogue</w:t>
+      </w:r>
+    </w:p>
+    <w:p>
+      <w:pPr>
+        <w:shd w:fill="F2F2F2" w:val="clear"/>
+        <w:spacing w:after="40" w:before="40"/>
+        <w:ind w:left="360"/>
+      </w:pPr>
+      <w:r>
+        <w:rPr>
+          <w:rFonts w:ascii="Courier New" w:cs="Courier New" w:eastAsia="Courier New" w:hAnsi="Courier New"/>
+          <w:color w:val="1E1E1E"/>
+          <w:sz w:val="20"/>
+          <w:szCs w:val="20"/>
+        </w:rPr>
+        <w:t xml:space="preserve">  Version  : 1.0.0</w:t>
+      </w:r>
+    </w:p>
+    <w:p>
+      <w:pPr>
+        <w:shd w:fill="F2F2F2" w:val="clear"/>
+        <w:spacing w:after="40" w:before="40"/>
+        <w:ind w:left="360"/>
+      </w:pPr>
+      <w:r>
+        <w:rPr>
+          <w:rFonts w:ascii="Courier New" w:cs="Courier New" w:eastAsia="Courier New" w:hAnsi="Courier New"/>
+          <w:color w:val="1E1E1E"/>
+          <w:sz w:val="20"/>
+          <w:szCs w:val="20"/>
+        </w:rPr>
+        <w:t xml:space="preserve">[PactFlow] Contract published successfully!</w:t>
+      </w:r>
+    </w:p>
+    <w:p>
+      <w:pPr>
+        <w:shd w:fill="F2F2F2" w:val="clear"/>
+        <w:spacing w:after="40" w:before="40"/>
+        <w:ind w:left="360"/>
+      </w:pPr>
+      <w:r>
+        <w:rPr>
+          <w:rFonts w:ascii="Courier New" w:cs="Courier New" w:eastAsia="Courier New" w:hAnsi="Courier New"/>
+          <w:color w:val="1E1E1E"/>
+          <w:sz w:val="20"/>
+          <w:szCs w:val="20"/>
+        </w:rPr>
+        <w:t xml:space="preserve">  View at: https://deepintent.pactflow.io/.../latest</w:t>
       </w:r>
     </w:p>
     <w:p>
@@ -4339,26 +4469,116 @@
     </w:p>
     <w:p>
       <w:pPr>
+        <w:pStyle w:val="ListParagraph"/>
+        <w:numPr>
+          <w:ilvl w:val="0"/>
+          <w:numId w:val="3"/>
+        </w:numPr>
+        <w:spacing w:after="60" w:before="60"/>
+      </w:pPr>
+      <w:r>
+        <w:rPr>
+          <w:rFonts w:ascii="Arial" w:cs="Arial" w:eastAsia="Arial" w:hAnsi="Arial"/>
+          <w:sz w:val="22"/>
+          <w:szCs w:val="22"/>
+        </w:rPr>
+        <w:t xml:space="preserve">pytest_sessionfinish hook in conftest.py fires — publishes contract to PactFlow automatically</w:t>
+      </w:r>
+    </w:p>
+    <w:p>
+      <w:pPr>
         <w:spacing w:after="60" w:before="60"/>
       </w:pPr>
     </w:p>
     <w:p>
       <w:pPr>
         <w:pBdr>
-          <w:left w:val="single" w:color="C55A11" w:sz="12" w:space="8"/>
+          <w:left w:val="single" w:color="375623" w:sz="12" w:space="8"/>
         </w:pBdr>
-        <w:shd w:fill="FFF2CC" w:val="clear"/>
-        <w:spacing w:after="120" w:before="120"/>
-        <w:ind w:left="360" w:right="360"/>
-      </w:pPr>
-      <w:r>
-        <w:rPr>
-          <w:rFonts w:ascii="Arial" w:cs="Arial" w:eastAsia="Arial" w:hAnsi="Arial"/>
-          <w:color w:val="C55A11"/>
-          <w:sz w:val="22"/>
-          <w:szCs w:val="22"/>
-        </w:rPr>
-        <w:t xml:space="preserve">⚠  The contract file is generated locally. It must be published to PactFlow before provider tests can use it.</w:t>
+        <w:shd w:fill="E2EFDA" w:val="clear"/>
+        <w:spacing w:after="80" w:before="80"/>
+        <w:ind w:left="360"/>
+      </w:pPr>
+      <w:r>
+        <w:rPr>
+          <w:rFonts w:ascii="Arial" w:cs="Arial" w:eastAsia="Arial" w:hAnsi="Arial"/>
+          <w:color w:val="375623"/>
+          <w:sz w:val="20"/>
+          <w:szCs w:val="20"/>
+        </w:rPr>
+        <w:t xml:space="preserve">HOW auto-publish works:  tests/consumer/conftest.py uses pytest's pytest_sessionfinish hook. It triggers after every test session and publishes ONLY when all tests pass and PACT_BROKER_TOKEN is set. Manual fallback: python scripts/publish_pact.py</w:t>
+      </w:r>
+    </w:p>
+    <w:p>
+      <w:pPr>
+        <w:spacing w:after="60" w:before="60"/>
+      </w:pPr>
+    </w:p>
+    <w:p>
+      <w:pPr>
+        <w:spacing w:after="80" w:before="80"/>
+      </w:pPr>
+      <w:r>
+        <w:rPr>
+          <w:rFonts w:ascii="Arial" w:cs="Arial" w:eastAsia="Arial" w:hAnsi="Arial"/>
+          <w:sz w:val="22"/>
+          <w:szCs w:val="22"/>
+        </w:rPr>
+        <w:t xml:space="preserve">Verify on PactFlow dashboard:</w:t>
+      </w:r>
+    </w:p>
+    <w:p>
+      <w:pPr>
+        <w:pStyle w:val="ListParagraph"/>
+        <w:numPr>
+          <w:ilvl w:val="0"/>
+          <w:numId w:val="3"/>
+        </w:numPr>
+        <w:spacing w:after="60" w:before="60"/>
+      </w:pPr>
+      <w:r>
+        <w:rPr>
+          <w:rFonts w:ascii="Arial" w:cs="Arial" w:eastAsia="Arial" w:hAnsi="Arial"/>
+          <w:sz w:val="22"/>
+          <w:szCs w:val="22"/>
+        </w:rPr>
+        <w:t xml:space="preserve">Go to  https://deepintent.pactflow.io</w:t>
+      </w:r>
+    </w:p>
+    <w:p>
+      <w:pPr>
+        <w:pStyle w:val="ListParagraph"/>
+        <w:numPr>
+          <w:ilvl w:val="0"/>
+          <w:numId w:val="3"/>
+        </w:numPr>
+        <w:spacing w:after="60" w:before="60"/>
+      </w:pPr>
+      <w:r>
+        <w:rPr>
+          <w:rFonts w:ascii="Arial" w:cs="Arial" w:eastAsia="Arial" w:hAnsi="Arial"/>
+          <w:sz w:val="22"/>
+          <w:szCs w:val="22"/>
+        </w:rPr>
+        <w:t xml:space="preserve">Navigate to:  Pacts  →  BooksCatalogue  →  CoursesCatalogue</w:t>
+      </w:r>
+    </w:p>
+    <w:p>
+      <w:pPr>
+        <w:pStyle w:val="ListParagraph"/>
+        <w:numPr>
+          <w:ilvl w:val="0"/>
+          <w:numId w:val="3"/>
+        </w:numPr>
+        <w:spacing w:after="60" w:before="60"/>
+      </w:pPr>
+      <w:r>
+        <w:rPr>
+          <w:rFonts w:ascii="Arial" w:cs="Arial" w:eastAsia="Arial" w:hAnsi="Arial"/>
+          <w:sz w:val="22"/>
+          <w:szCs w:val="22"/>
+        </w:rPr>
+        <w:t xml:space="preserve">You will see the contract JSON with all 3 interactions</w:t>
       </w:r>
     </w:p>
     <w:p>
@@ -4428,7 +4648,7 @@
                 <w:sz w:val="28"/>
                 <w:szCs w:val="28"/>
               </w:rPr>
-              <w:t xml:space="preserve">Publish Contract to PactFlow</w:t>
+              <w:t xml:space="preserve">Run Provider Tests  (Verify Against Contract)</w:t>
             </w:r>
           </w:p>
         </w:tc>
@@ -4449,7 +4669,7 @@
           <w:sz w:val="22"/>
           <w:szCs w:val="22"/>
         </w:rPr>
-        <w:t xml:space="preserve">This uploads the contract to the cloud broker so any team member or CI pipeline can access it. The PACT_BROKER_TOKEN must be set (Step 4).</w:t>
+        <w:t xml:space="preserve">The provider tests fetch the contract from PactFlow and verify the REAL CoursesCatalogue service satisfies every interaction. The PACT_BROKER_TOKEN must be set (Step 4).</w:t>
       </w:r>
     </w:p>
     <w:p>
@@ -4483,7 +4703,7 @@
           <w:sz w:val="20"/>
           <w:szCs w:val="20"/>
         </w:rPr>
-        <w:t xml:space="preserve">python scripts/publish_pact.py</w:t>
+        <w:t xml:space="preserve">pytest tests/provider/ -v -s</w:t>
       </w:r>
     </w:p>
     <w:p>
@@ -4517,71 +4737,7 @@
           <w:sz w:val="20"/>
           <w:szCs w:val="20"/>
         </w:rPr>
-        <w:t xml:space="preserve">Publishing contract to PactFlow...</w:t>
-      </w:r>
-    </w:p>
-    <w:p>
-      <w:pPr>
-        <w:shd w:fill="F2F2F2" w:val="clear"/>
-        <w:spacing w:after="40" w:before="40"/>
-        <w:ind w:left="360"/>
-      </w:pPr>
-      <w:r>
-        <w:rPr>
-          <w:rFonts w:ascii="Courier New" w:cs="Courier New" w:eastAsia="Courier New" w:hAnsi="Courier New"/>
-          <w:color w:val="1E1E1E"/>
-          <w:sz w:val="20"/>
-          <w:szCs w:val="20"/>
-        </w:rPr>
-        <w:t xml:space="preserve">  Consumer : BooksCatalogue</w:t>
-      </w:r>
-    </w:p>
-    <w:p>
-      <w:pPr>
-        <w:shd w:fill="F2F2F2" w:val="clear"/>
-        <w:spacing w:after="40" w:before="40"/>
-        <w:ind w:left="360"/>
-      </w:pPr>
-      <w:r>
-        <w:rPr>
-          <w:rFonts w:ascii="Courier New" w:cs="Courier New" w:eastAsia="Courier New" w:hAnsi="Courier New"/>
-          <w:color w:val="1E1E1E"/>
-          <w:sz w:val="20"/>
-          <w:szCs w:val="20"/>
-        </w:rPr>
-        <w:t xml:space="preserve">  Provider : CoursesCatalogue</w:t>
-      </w:r>
-    </w:p>
-    <w:p>
-      <w:pPr>
-        <w:shd w:fill="F2F2F2" w:val="clear"/>
-        <w:spacing w:after="40" w:before="40"/>
-        <w:ind w:left="360"/>
-      </w:pPr>
-      <w:r>
-        <w:rPr>
-          <w:rFonts w:ascii="Courier New" w:cs="Courier New" w:eastAsia="Courier New" w:hAnsi="Courier New"/>
-          <w:color w:val="1E1E1E"/>
-          <w:sz w:val="20"/>
-          <w:szCs w:val="20"/>
-        </w:rPr>
-        <w:t xml:space="preserve">  Version  : 1.0.0</w:t>
-      </w:r>
-    </w:p>
-    <w:p>
-      <w:pPr>
-        <w:shd w:fill="F2F2F2" w:val="clear"/>
-        <w:spacing w:after="40" w:before="40"/>
-        <w:ind w:left="360"/>
-      </w:pPr>
-      <w:r>
-        <w:rPr>
-          <w:rFonts w:ascii="Courier New" w:cs="Courier New" w:eastAsia="Courier New" w:hAnsi="Courier New"/>
-          <w:color w:val="1E1E1E"/>
-          <w:sz w:val="20"/>
-          <w:szCs w:val="20"/>
-        </w:rPr>
-        <w:t xml:space="preserve">  Broker   : https://deepintent.pactflow.io</w:t>
+        <w:t xml:space="preserve">tests/provider/test_pact_provider.py::test_pact_provider</w:t>
       </w:r>
     </w:p>
     <w:p>
@@ -4613,23 +4769,87 @@
           <w:sz w:val="20"/>
           <w:szCs w:val="20"/>
         </w:rPr>
-        <w:t xml:space="preserve">[SUCCESS] Contract published successfully!</w:t>
-      </w:r>
-    </w:p>
-    <w:p>
-      <w:pPr>
-        <w:shd w:fill="F2F2F2" w:val="clear"/>
-        <w:spacing w:after="40" w:before="40"/>
-        <w:ind w:left="360"/>
-      </w:pPr>
-      <w:r>
-        <w:rPr>
-          <w:rFonts w:ascii="Courier New" w:cs="Courier New" w:eastAsia="Courier New" w:hAnsi="Courier New"/>
-          <w:color w:val="1E1E1E"/>
-          <w:sz w:val="20"/>
-          <w:szCs w:val="20"/>
-        </w:rPr>
-        <w:t xml:space="preserve">  View at: https://deepintent.pactflow.io/pacts/provider/CoursesCatalogue/consumer/BooksCatalogue/latest</w:t>
+        <w:t xml:space="preserve">  Verifying pact: BooksCatalogue → CoursesCatalogue</w:t>
+      </w:r>
+    </w:p>
+    <w:p>
+      <w:pPr>
+        <w:shd w:fill="F2F2F2" w:val="clear"/>
+        <w:spacing w:after="40" w:before="40"/>
+        <w:ind w:left="360"/>
+      </w:pPr>
+      <w:r>
+        <w:rPr>
+          <w:rFonts w:ascii="Courier New" w:cs="Courier New" w:eastAsia="Courier New" w:hAnsi="Courier New"/>
+          <w:color w:val="1E1E1E"/>
+          <w:sz w:val="20"/>
+          <w:szCs w:val="20"/>
+        </w:rPr>
+        <w:t xml:space="preserve">  Setting up provider state 'courses exist'                → PASSED ✅</w:t>
+      </w:r>
+    </w:p>
+    <w:p>
+      <w:pPr>
+        <w:shd w:fill="F2F2F2" w:val="clear"/>
+        <w:spacing w:after="40" w:before="40"/>
+        <w:ind w:left="360"/>
+      </w:pPr>
+      <w:r>
+        <w:rPr>
+          <w:rFonts w:ascii="Courier New" w:cs="Courier New" w:eastAsia="Courier New" w:hAnsi="Courier New"/>
+          <w:color w:val="1E1E1E"/>
+          <w:sz w:val="20"/>
+          <w:szCs w:val="20"/>
+        </w:rPr>
+        <w:t xml:space="preserve">  Setting up provider state 'Course Appium exist'          → PASSED ✅</w:t>
+      </w:r>
+    </w:p>
+    <w:p>
+      <w:pPr>
+        <w:shd w:fill="F2F2F2" w:val="clear"/>
+        <w:spacing w:after="40" w:before="40"/>
+        <w:ind w:left="360"/>
+      </w:pPr>
+      <w:r>
+        <w:rPr>
+          <w:rFonts w:ascii="Courier New" w:cs="Courier New" w:eastAsia="Courier New" w:hAnsi="Courier New"/>
+          <w:color w:val="1E1E1E"/>
+          <w:sz w:val="20"/>
+          <w:szCs w:val="20"/>
+        </w:rPr>
+        <w:t xml:space="preserve">  Setting up provider state 'Course Appium does not exist' → PASSED ✅</w:t>
+      </w:r>
+    </w:p>
+    <w:p>
+      <w:pPr>
+        <w:shd w:fill="F2F2F2" w:val="clear"/>
+        <w:spacing w:after="40" w:before="40"/>
+        <w:ind w:left="360"/>
+      </w:pPr>
+      <w:r>
+        <w:rPr>
+          <w:rFonts w:ascii="Courier New" w:cs="Courier New" w:eastAsia="Courier New" w:hAnsi="Courier New"/>
+          <w:color w:val="1E1E1E"/>
+          <w:sz w:val="20"/>
+          <w:szCs w:val="20"/>
+        </w:rPr>
+        <w:t xml:space="preserve"/>
+      </w:r>
+    </w:p>
+    <w:p>
+      <w:pPr>
+        <w:shd w:fill="F2F2F2" w:val="clear"/>
+        <w:spacing w:after="40" w:before="40"/>
+        <w:ind w:left="360"/>
+      </w:pPr>
+      <w:r>
+        <w:rPr>
+          <w:rFonts w:ascii="Courier New" w:cs="Courier New" w:eastAsia="Courier New" w:hAnsi="Courier New"/>
+          <w:color w:val="1E1E1E"/>
+          <w:sz w:val="20"/>
+          <w:szCs w:val="20"/>
+        </w:rPr>
+        <w:t xml:space="preserve">1 passed</w:t>
       </w:r>
     </w:p>
     <w:p>
@@ -4647,7 +4867,7 @@
           <w:sz w:val="22"/>
           <w:szCs w:val="22"/>
         </w:rPr>
-        <w:t xml:space="preserve">Verify on PactFlow dashboard:</w:t>
+        <w:t xml:space="preserve">What happens internally:</w:t>
       </w:r>
     </w:p>
     <w:p>
@@ -4665,7 +4885,7 @@
           <w:sz w:val="22"/>
           <w:szCs w:val="22"/>
         </w:rPr>
-        <w:t xml:space="preserve">Go to  https://deepintent.pactflow.io</w:t>
+        <w:t xml:space="preserve">pactman fetches the contract from PactFlow (not from local file)</w:t>
       </w:r>
     </w:p>
     <w:p>
@@ -4683,7 +4903,7 @@
           <w:sz w:val="22"/>
           <w:szCs w:val="22"/>
         </w:rPr>
-        <w:t xml:space="preserve">Navigate to:  Pacts  →  BooksCatalogue  →  CoursesCatalogue</w:t>
+        <w:t xml:space="preserve">A state server starts on port 8182 — receives pactman's HTTP POSTs</w:t>
       </w:r>
     </w:p>
     <w:p>
@@ -4701,7 +4921,82 @@
           <w:sz w:val="22"/>
           <w:szCs w:val="22"/>
         </w:rPr>
-        <w:t xml:space="preserve">You will see the contract JSON with all 3 interactions</w:t>
+        <w:t xml:space="preserve">For each interaction in the contract:</w:t>
+      </w:r>
+    </w:p>
+    <w:p>
+      <w:pPr>
+        <w:pStyle w:val="ListParagraph"/>
+        <w:numPr>
+          <w:ilvl w:val="0"/>
+          <w:numId w:val="2"/>
+        </w:numPr>
+        <w:spacing w:after="40" w:before="40"/>
+        <w:ind w:left="900" w:hanging="260"/>
+      </w:pPr>
+      <w:r>
+        <w:rPr>
+          <w:rFonts w:ascii="Arial" w:cs="Arial" w:eastAsia="Arial" w:hAnsi="Arial"/>
+          <w:sz w:val="22"/>
+          <w:szCs w:val="22"/>
+        </w:rPr>
+        <w:t xml:space="preserve">POST to state server → DB set up (insert/delete records)</w:t>
+      </w:r>
+    </w:p>
+    <w:p>
+      <w:pPr>
+        <w:pStyle w:val="ListParagraph"/>
+        <w:numPr>
+          <w:ilvl w:val="0"/>
+          <w:numId w:val="2"/>
+        </w:numPr>
+        <w:spacing w:after="40" w:before="40"/>
+        <w:ind w:left="900" w:hanging="260"/>
+      </w:pPr>
+      <w:r>
+        <w:rPr>
+          <w:rFonts w:ascii="Arial" w:cs="Arial" w:eastAsia="Arial" w:hAnsi="Arial"/>
+          <w:sz w:val="22"/>
+          <w:szCs w:val="22"/>
+        </w:rPr>
+        <w:t xml:space="preserve">Real HTTP request sent to CoursesCatalogue (port 8181)</w:t>
+      </w:r>
+    </w:p>
+    <w:p>
+      <w:pPr>
+        <w:pStyle w:val="ListParagraph"/>
+        <w:numPr>
+          <w:ilvl w:val="0"/>
+          <w:numId w:val="2"/>
+        </w:numPr>
+        <w:spacing w:after="40" w:before="40"/>
+        <w:ind w:left="900" w:hanging="260"/>
+      </w:pPr>
+      <w:r>
+        <w:rPr>
+          <w:rFonts w:ascii="Arial" w:cs="Arial" w:eastAsia="Arial" w:hAnsi="Arial"/>
+          <w:sz w:val="22"/>
+          <w:szCs w:val="22"/>
+        </w:rPr>
+        <w:t xml:space="preserve">Real response compared against contract spec → PASS / FAIL</w:t>
+      </w:r>
+    </w:p>
+    <w:p>
+      <w:pPr>
+        <w:pStyle w:val="ListParagraph"/>
+        <w:numPr>
+          <w:ilvl w:val="0"/>
+          <w:numId w:val="3"/>
+        </w:numPr>
+        <w:spacing w:after="60" w:before="60"/>
+      </w:pPr>
+      <w:r>
+        <w:rPr>
+          <w:rFonts w:ascii="Arial" w:cs="Arial" w:eastAsia="Arial" w:hAnsi="Arial"/>
+          <w:sz w:val="22"/>
+          <w:szCs w:val="22"/>
+        </w:rPr>
+        <w:t xml:space="preserve">All 3 interactions pass → Provider satisfies the contract ✅</w:t>
       </w:r>
     </w:p>
     <w:p>
@@ -4761,424 +5056,6 @@
                 <w:szCs w:val="28"/>
               </w:rPr>
               <w:t xml:space="preserve">Step 10:  </w:t>
-            </w:r>
-            <w:r>
-              <w:rPr>
-                <w:rFonts w:ascii="Arial" w:cs="Arial" w:eastAsia="Arial" w:hAnsi="Arial"/>
-                <w:b/>
-                <w:bCs/>
-                <w:color w:val="FFFFFF"/>
-                <w:sz w:val="28"/>
-                <w:szCs w:val="28"/>
-              </w:rPr>
-              <w:t xml:space="preserve">Run Provider Tests  (Verify Against Contract)</w:t>
-            </w:r>
-          </w:p>
-        </w:tc>
-      </w:tr>
-    </w:tbl>
-    <w:p>
-      <w:pPr>
-        <w:spacing w:after="60" w:before="60"/>
-      </w:pPr>
-    </w:p>
-    <w:p>
-      <w:pPr>
-        <w:spacing w:after="80" w:before="80"/>
-      </w:pPr>
-      <w:r>
-        <w:rPr>
-          <w:rFonts w:ascii="Arial" w:cs="Arial" w:eastAsia="Arial" w:hAnsi="Arial"/>
-          <w:sz w:val="22"/>
-          <w:szCs w:val="22"/>
-        </w:rPr>
-        <w:t xml:space="preserve">The provider tests fetch the contract from PactFlow and verify the REAL CoursesCatalogue service satisfies every interaction. The PACT_BROKER_TOKEN must be set (Step 4).</w:t>
-      </w:r>
-    </w:p>
-    <w:p>
-      <w:pPr>
-        <w:spacing w:after="60" w:before="60"/>
-      </w:pPr>
-    </w:p>
-    <w:p>
-      <w:pPr>
-        <w:spacing w:after="80" w:before="80"/>
-      </w:pPr>
-      <w:r>
-        <w:rPr>
-          <w:rFonts w:ascii="Arial" w:cs="Arial" w:eastAsia="Arial" w:hAnsi="Arial"/>
-          <w:sz w:val="22"/>
-          <w:szCs w:val="22"/>
-        </w:rPr>
-        <w:t xml:space="preserve">Run:</w:t>
-      </w:r>
-    </w:p>
-    <w:p>
-      <w:pPr>
-        <w:shd w:fill="F2F2F2" w:val="clear"/>
-        <w:spacing w:after="40" w:before="40"/>
-        <w:ind w:left="360"/>
-      </w:pPr>
-      <w:r>
-        <w:rPr>
-          <w:rFonts w:ascii="Courier New" w:cs="Courier New" w:eastAsia="Courier New" w:hAnsi="Courier New"/>
-          <w:color w:val="1E1E1E"/>
-          <w:sz w:val="20"/>
-          <w:szCs w:val="20"/>
-        </w:rPr>
-        <w:t xml:space="preserve">pytest tests/provider/ -v -s</w:t>
-      </w:r>
-    </w:p>
-    <w:p>
-      <w:pPr>
-        <w:spacing w:after="60" w:before="60"/>
-      </w:pPr>
-    </w:p>
-    <w:p>
-      <w:pPr>
-        <w:spacing w:after="80" w:before="80"/>
-      </w:pPr>
-      <w:r>
-        <w:rPr>
-          <w:rFonts w:ascii="Arial" w:cs="Arial" w:eastAsia="Arial" w:hAnsi="Arial"/>
-          <w:sz w:val="22"/>
-          <w:szCs w:val="22"/>
-        </w:rPr>
-        <w:t xml:space="preserve">Expected output:</w:t>
-      </w:r>
-    </w:p>
-    <w:p>
-      <w:pPr>
-        <w:shd w:fill="F2F2F2" w:val="clear"/>
-        <w:spacing w:after="40" w:before="40"/>
-        <w:ind w:left="360"/>
-      </w:pPr>
-      <w:r>
-        <w:rPr>
-          <w:rFonts w:ascii="Courier New" w:cs="Courier New" w:eastAsia="Courier New" w:hAnsi="Courier New"/>
-          <w:color w:val="1E1E1E"/>
-          <w:sz w:val="20"/>
-          <w:szCs w:val="20"/>
-        </w:rPr>
-        <w:t xml:space="preserve">tests/provider/test_pact_provider.py::test_pact_provider</w:t>
-      </w:r>
-    </w:p>
-    <w:p>
-      <w:pPr>
-        <w:shd w:fill="F2F2F2" w:val="clear"/>
-        <w:spacing w:after="40" w:before="40"/>
-        <w:ind w:left="360"/>
-      </w:pPr>
-      <w:r>
-        <w:rPr>
-          <w:rFonts w:ascii="Courier New" w:cs="Courier New" w:eastAsia="Courier New" w:hAnsi="Courier New"/>
-          <w:color w:val="1E1E1E"/>
-          <w:sz w:val="20"/>
-          <w:szCs w:val="20"/>
-        </w:rPr>
-        <w:t xml:space="preserve"/>
-      </w:r>
-    </w:p>
-    <w:p>
-      <w:pPr>
-        <w:shd w:fill="F2F2F2" w:val="clear"/>
-        <w:spacing w:after="40" w:before="40"/>
-        <w:ind w:left="360"/>
-      </w:pPr>
-      <w:r>
-        <w:rPr>
-          <w:rFonts w:ascii="Courier New" w:cs="Courier New" w:eastAsia="Courier New" w:hAnsi="Courier New"/>
-          <w:color w:val="1E1E1E"/>
-          <w:sz w:val="20"/>
-          <w:szCs w:val="20"/>
-        </w:rPr>
-        <w:t xml:space="preserve">  Verifying pact: BooksCatalogue → CoursesCatalogue</w:t>
-      </w:r>
-    </w:p>
-    <w:p>
-      <w:pPr>
-        <w:shd w:fill="F2F2F2" w:val="clear"/>
-        <w:spacing w:after="40" w:before="40"/>
-        <w:ind w:left="360"/>
-      </w:pPr>
-      <w:r>
-        <w:rPr>
-          <w:rFonts w:ascii="Courier New" w:cs="Courier New" w:eastAsia="Courier New" w:hAnsi="Courier New"/>
-          <w:color w:val="1E1E1E"/>
-          <w:sz w:val="20"/>
-          <w:szCs w:val="20"/>
-        </w:rPr>
-        <w:t xml:space="preserve">  Setting up provider state 'courses exist'                → PASSED ✅</w:t>
-      </w:r>
-    </w:p>
-    <w:p>
-      <w:pPr>
-        <w:shd w:fill="F2F2F2" w:val="clear"/>
-        <w:spacing w:after="40" w:before="40"/>
-        <w:ind w:left="360"/>
-      </w:pPr>
-      <w:r>
-        <w:rPr>
-          <w:rFonts w:ascii="Courier New" w:cs="Courier New" w:eastAsia="Courier New" w:hAnsi="Courier New"/>
-          <w:color w:val="1E1E1E"/>
-          <w:sz w:val="20"/>
-          <w:szCs w:val="20"/>
-        </w:rPr>
-        <w:t xml:space="preserve">  Setting up provider state 'Course Appium exist'          → PASSED ✅</w:t>
-      </w:r>
-    </w:p>
-    <w:p>
-      <w:pPr>
-        <w:shd w:fill="F2F2F2" w:val="clear"/>
-        <w:spacing w:after="40" w:before="40"/>
-        <w:ind w:left="360"/>
-      </w:pPr>
-      <w:r>
-        <w:rPr>
-          <w:rFonts w:ascii="Courier New" w:cs="Courier New" w:eastAsia="Courier New" w:hAnsi="Courier New"/>
-          <w:color w:val="1E1E1E"/>
-          <w:sz w:val="20"/>
-          <w:szCs w:val="20"/>
-        </w:rPr>
-        <w:t xml:space="preserve">  Setting up provider state 'Course Appium does not exist' → PASSED ✅</w:t>
-      </w:r>
-    </w:p>
-    <w:p>
-      <w:pPr>
-        <w:shd w:fill="F2F2F2" w:val="clear"/>
-        <w:spacing w:after="40" w:before="40"/>
-        <w:ind w:left="360"/>
-      </w:pPr>
-      <w:r>
-        <w:rPr>
-          <w:rFonts w:ascii="Courier New" w:cs="Courier New" w:eastAsia="Courier New" w:hAnsi="Courier New"/>
-          <w:color w:val="1E1E1E"/>
-          <w:sz w:val="20"/>
-          <w:szCs w:val="20"/>
-        </w:rPr>
-        <w:t xml:space="preserve"/>
-      </w:r>
-    </w:p>
-    <w:p>
-      <w:pPr>
-        <w:shd w:fill="F2F2F2" w:val="clear"/>
-        <w:spacing w:after="40" w:before="40"/>
-        <w:ind w:left="360"/>
-      </w:pPr>
-      <w:r>
-        <w:rPr>
-          <w:rFonts w:ascii="Courier New" w:cs="Courier New" w:eastAsia="Courier New" w:hAnsi="Courier New"/>
-          <w:color w:val="1E1E1E"/>
-          <w:sz w:val="20"/>
-          <w:szCs w:val="20"/>
-        </w:rPr>
-        <w:t xml:space="preserve">1 passed</w:t>
-      </w:r>
-    </w:p>
-    <w:p>
-      <w:pPr>
-        <w:spacing w:after="60" w:before="60"/>
-      </w:pPr>
-    </w:p>
-    <w:p>
-      <w:pPr>
-        <w:spacing w:after="80" w:before="80"/>
-      </w:pPr>
-      <w:r>
-        <w:rPr>
-          <w:rFonts w:ascii="Arial" w:cs="Arial" w:eastAsia="Arial" w:hAnsi="Arial"/>
-          <w:sz w:val="22"/>
-          <w:szCs w:val="22"/>
-        </w:rPr>
-        <w:t xml:space="preserve">What happens internally:</w:t>
-      </w:r>
-    </w:p>
-    <w:p>
-      <w:pPr>
-        <w:pStyle w:val="ListParagraph"/>
-        <w:numPr>
-          <w:ilvl w:val="0"/>
-          <w:numId w:val="3"/>
-        </w:numPr>
-        <w:spacing w:after="60" w:before="60"/>
-      </w:pPr>
-      <w:r>
-        <w:rPr>
-          <w:rFonts w:ascii="Arial" w:cs="Arial" w:eastAsia="Arial" w:hAnsi="Arial"/>
-          <w:sz w:val="22"/>
-          <w:szCs w:val="22"/>
-        </w:rPr>
-        <w:t xml:space="preserve">pactman fetches the contract from PactFlow (not from local file)</w:t>
-      </w:r>
-    </w:p>
-    <w:p>
-      <w:pPr>
-        <w:pStyle w:val="ListParagraph"/>
-        <w:numPr>
-          <w:ilvl w:val="0"/>
-          <w:numId w:val="3"/>
-        </w:numPr>
-        <w:spacing w:after="60" w:before="60"/>
-      </w:pPr>
-      <w:r>
-        <w:rPr>
-          <w:rFonts w:ascii="Arial" w:cs="Arial" w:eastAsia="Arial" w:hAnsi="Arial"/>
-          <w:sz w:val="22"/>
-          <w:szCs w:val="22"/>
-        </w:rPr>
-        <w:t xml:space="preserve">A state server starts on port 8182 — receives pactman's HTTP POSTs</w:t>
-      </w:r>
-    </w:p>
-    <w:p>
-      <w:pPr>
-        <w:pStyle w:val="ListParagraph"/>
-        <w:numPr>
-          <w:ilvl w:val="0"/>
-          <w:numId w:val="3"/>
-        </w:numPr>
-        <w:spacing w:after="60" w:before="60"/>
-      </w:pPr>
-      <w:r>
-        <w:rPr>
-          <w:rFonts w:ascii="Arial" w:cs="Arial" w:eastAsia="Arial" w:hAnsi="Arial"/>
-          <w:sz w:val="22"/>
-          <w:szCs w:val="22"/>
-        </w:rPr>
-        <w:t xml:space="preserve">For each interaction in the contract:</w:t>
-      </w:r>
-    </w:p>
-    <w:p>
-      <w:pPr>
-        <w:pStyle w:val="ListParagraph"/>
-        <w:numPr>
-          <w:ilvl w:val="0"/>
-          <w:numId w:val="2"/>
-        </w:numPr>
-        <w:spacing w:after="40" w:before="40"/>
-        <w:ind w:left="900" w:hanging="260"/>
-      </w:pPr>
-      <w:r>
-        <w:rPr>
-          <w:rFonts w:ascii="Arial" w:cs="Arial" w:eastAsia="Arial" w:hAnsi="Arial"/>
-          <w:sz w:val="22"/>
-          <w:szCs w:val="22"/>
-        </w:rPr>
-        <w:t xml:space="preserve">POST to state server → DB set up (insert/delete records)</w:t>
-      </w:r>
-    </w:p>
-    <w:p>
-      <w:pPr>
-        <w:pStyle w:val="ListParagraph"/>
-        <w:numPr>
-          <w:ilvl w:val="0"/>
-          <w:numId w:val="2"/>
-        </w:numPr>
-        <w:spacing w:after="40" w:before="40"/>
-        <w:ind w:left="900" w:hanging="260"/>
-      </w:pPr>
-      <w:r>
-        <w:rPr>
-          <w:rFonts w:ascii="Arial" w:cs="Arial" w:eastAsia="Arial" w:hAnsi="Arial"/>
-          <w:sz w:val="22"/>
-          <w:szCs w:val="22"/>
-        </w:rPr>
-        <w:t xml:space="preserve">Real HTTP request sent to CoursesCatalogue (port 8181)</w:t>
-      </w:r>
-    </w:p>
-    <w:p>
-      <w:pPr>
-        <w:pStyle w:val="ListParagraph"/>
-        <w:numPr>
-          <w:ilvl w:val="0"/>
-          <w:numId w:val="2"/>
-        </w:numPr>
-        <w:spacing w:after="40" w:before="40"/>
-        <w:ind w:left="900" w:hanging="260"/>
-      </w:pPr>
-      <w:r>
-        <w:rPr>
-          <w:rFonts w:ascii="Arial" w:cs="Arial" w:eastAsia="Arial" w:hAnsi="Arial"/>
-          <w:sz w:val="22"/>
-          <w:szCs w:val="22"/>
-        </w:rPr>
-        <w:t xml:space="preserve">Real response compared against contract spec → PASS / FAIL</w:t>
-      </w:r>
-    </w:p>
-    <w:p>
-      <w:pPr>
-        <w:pStyle w:val="ListParagraph"/>
-        <w:numPr>
-          <w:ilvl w:val="0"/>
-          <w:numId w:val="3"/>
-        </w:numPr>
-        <w:spacing w:after="60" w:before="60"/>
-      </w:pPr>
-      <w:r>
-        <w:rPr>
-          <w:rFonts w:ascii="Arial" w:cs="Arial" w:eastAsia="Arial" w:hAnsi="Arial"/>
-          <w:sz w:val="22"/>
-          <w:szCs w:val="22"/>
-        </w:rPr>
-        <w:t xml:space="preserve">All 3 interactions pass → Provider satisfies the contract ✅</w:t>
-      </w:r>
-    </w:p>
-    <w:p>
-      <w:pPr>
-        <w:spacing w:after="60" w:before="60"/>
-      </w:pPr>
-    </w:p>
-    <w:p>
-      <w:pPr>
-        <w:pBdr>
-          <w:bottom w:val="single" w:color="2E75B6" w:sz="6"/>
-        </w:pBdr>
-        <w:spacing w:after="160" w:before="160"/>
-      </w:pPr>
-    </w:p>
-    <w:tbl>
-      <w:tblPr>
-        <w:tblW w:type="dxa" w:w="9360"/>
-        <w:tblBorders>
-          <w:top w:val="single" w:color="auto" w:sz="4"/>
-          <w:left w:val="single" w:color="auto" w:sz="4"/>
-          <w:bottom w:val="single" w:color="auto" w:sz="4"/>
-          <w:right w:val="single" w:color="auto" w:sz="4"/>
-          <w:insideH w:val="single" w:color="auto" w:sz="4"/>
-          <w:insideV w:val="single" w:color="auto" w:sz="4"/>
-        </w:tblBorders>
-      </w:tblPr>
-      <w:tblGrid>
-        <w:gridCol w:w="9360"/>
-      </w:tblGrid>
-      <w:tr>
-        <w:tc>
-          <w:tcPr>
-            <w:tcW w:type="dxa" w:w="9360"/>
-            <w:tcBorders>
-              <w:top w:val="single" w:color="2E75B6" w:sz="1"/>
-              <w:left w:val="single" w:color="2E75B6" w:sz="1"/>
-              <w:bottom w:val="single" w:color="2E75B6" w:sz="1"/>
-              <w:right w:val="single" w:color="2E75B6" w:sz="1"/>
-            </w:tcBorders>
-            <w:shd w:fill="1F3864" w:val="clear"/>
-            <w:tcMar>
-              <w:top w:type="dxa" w:w="100"/>
-              <w:left w:type="dxa" w:w="200"/>
-              <w:bottom w:type="dxa" w:w="100"/>
-              <w:right w:type="dxa" w:w="200"/>
-            </w:tcMar>
-          </w:tcPr>
-          <w:p>
-            <w:r>
-              <w:rPr>
-                <w:rFonts w:ascii="Arial" w:cs="Arial" w:eastAsia="Arial" w:hAnsi="Arial"/>
-                <w:b/>
-                <w:bCs/>
-                <w:color w:val="FFD700"/>
-                <w:sz w:val="28"/>
-                <w:szCs w:val="28"/>
-              </w:rPr>
-              <w:t xml:space="preserve">Step 11:  </w:t>
             </w:r>
             <w:r>
               <w:rPr>
@@ -6509,6 +6386,180 @@
           </w:p>
         </w:tc>
       </w:tr>
+      <w:tr>
+        <w:tc>
+          <w:tcPr>
+            <w:tcW w:type="dxa" w:w="4200"/>
+            <w:tcBorders>
+              <w:top w:val="single" w:color="CCCCCC" w:sz="1"/>
+              <w:left w:val="single" w:color="CCCCCC" w:sz="1"/>
+              <w:bottom w:val="single" w:color="CCCCCC" w:sz="1"/>
+              <w:right w:val="single" w:color="CCCCCC" w:sz="1"/>
+            </w:tcBorders>
+            <w:shd w:fill="FFF2CC" w:val="clear"/>
+            <w:tcMar>
+              <w:top w:type="dxa" w:w="60"/>
+              <w:left w:type="dxa" w:w="100"/>
+              <w:bottom w:type="dxa" w:w="60"/>
+              <w:right w:type="dxa" w:w="100"/>
+            </w:tcMar>
+          </w:tcPr>
+          <w:p>
+            <w:r>
+              <w:rPr>
+                <w:rFonts w:ascii="Arial" w:cs="Arial" w:eastAsia="Arial" w:hAnsi="Arial"/>
+                <w:sz w:val="20"/>
+                <w:szCs w:val="20"/>
+              </w:rPr>
+              <w:t xml:space="preserve">[PactFlow] Skipping auto-publish — PACT_BROKER_TOKEN not set</w:t>
+            </w:r>
+          </w:p>
+        </w:tc>
+        <w:tc>
+          <w:tcPr>
+            <w:tcW w:type="dxa" w:w="5160"/>
+            <w:tcBorders>
+              <w:top w:val="single" w:color="CCCCCC" w:sz="1"/>
+              <w:left w:val="single" w:color="CCCCCC" w:sz="1"/>
+              <w:bottom w:val="single" w:color="CCCCCC" w:sz="1"/>
+              <w:right w:val="single" w:color="CCCCCC" w:sz="1"/>
+            </w:tcBorders>
+            <w:shd w:fill="FFF2CC" w:val="clear"/>
+            <w:tcMar>
+              <w:top w:type="dxa" w:w="60"/>
+              <w:left w:type="dxa" w:w="100"/>
+              <w:bottom w:type="dxa" w:w="60"/>
+              <w:right w:type="dxa" w:w="100"/>
+            </w:tcMar>
+          </w:tcPr>
+          <w:p>
+            <w:r>
+              <w:rPr>
+                <w:rFonts w:ascii="Arial" w:cs="Arial" w:eastAsia="Arial" w:hAnsi="Arial"/>
+                <w:sz w:val="20"/>
+                <w:szCs w:val="20"/>
+              </w:rPr>
+              <w:t xml:space="preserve">Set token before running: $env:PACT_BROKER_TOKEN = "your-token"</w:t>
+            </w:r>
+          </w:p>
+        </w:tc>
+      </w:tr>
+      <w:tr>
+        <w:tc>
+          <w:tcPr>
+            <w:tcW w:type="dxa" w:w="4200"/>
+            <w:tcBorders>
+              <w:top w:val="single" w:color="CCCCCC" w:sz="1"/>
+              <w:left w:val="single" w:color="CCCCCC" w:sz="1"/>
+              <w:bottom w:val="single" w:color="CCCCCC" w:sz="1"/>
+              <w:right w:val="single" w:color="CCCCCC" w:sz="1"/>
+            </w:tcBorders>
+            <w:shd w:fill="FFFFFF" w:val="clear"/>
+            <w:tcMar>
+              <w:top w:type="dxa" w:w="60"/>
+              <w:left w:type="dxa" w:w="100"/>
+              <w:bottom w:type="dxa" w:w="60"/>
+              <w:right w:type="dxa" w:w="100"/>
+            </w:tcMar>
+          </w:tcPr>
+          <w:p>
+            <w:r>
+              <w:rPr>
+                <w:rFonts w:ascii="Arial" w:cs="Arial" w:eastAsia="Arial" w:hAnsi="Arial"/>
+                <w:sz w:val="20"/>
+                <w:szCs w:val="20"/>
+              </w:rPr>
+              <w:t xml:space="preserve">Auto-publish not triggering after consumer tests</w:t>
+            </w:r>
+          </w:p>
+        </w:tc>
+        <w:tc>
+          <w:tcPr>
+            <w:tcW w:type="dxa" w:w="5160"/>
+            <w:tcBorders>
+              <w:top w:val="single" w:color="CCCCCC" w:sz="1"/>
+              <w:left w:val="single" w:color="CCCCCC" w:sz="1"/>
+              <w:bottom w:val="single" w:color="CCCCCC" w:sz="1"/>
+              <w:right w:val="single" w:color="CCCCCC" w:sz="1"/>
+            </w:tcBorders>
+            <w:shd w:fill="FFFFFF" w:val="clear"/>
+            <w:tcMar>
+              <w:top w:type="dxa" w:w="60"/>
+              <w:left w:type="dxa" w:w="100"/>
+              <w:bottom w:type="dxa" w:w="60"/>
+              <w:right w:type="dxa" w:w="100"/>
+            </w:tcMar>
+          </w:tcPr>
+          <w:p>
+            <w:r>
+              <w:rPr>
+                <w:rFonts w:ascii="Arial" w:cs="Arial" w:eastAsia="Arial" w:hAnsi="Arial"/>
+                <w:sz w:val="20"/>
+                <w:szCs w:val="20"/>
+              </w:rPr>
+              <w:t xml:space="preserve">Check tests are all passing — conftest.py only publishes on exitstatus=0 (all passed)</w:t>
+            </w:r>
+          </w:p>
+        </w:tc>
+      </w:tr>
+      <w:tr>
+        <w:tc>
+          <w:tcPr>
+            <w:tcW w:type="dxa" w:w="4200"/>
+            <w:tcBorders>
+              <w:top w:val="single" w:color="CCCCCC" w:sz="1"/>
+              <w:left w:val="single" w:color="CCCCCC" w:sz="1"/>
+              <w:bottom w:val="single" w:color="CCCCCC" w:sz="1"/>
+              <w:right w:val="single" w:color="CCCCCC" w:sz="1"/>
+            </w:tcBorders>
+            <w:shd w:fill="FFF2CC" w:val="clear"/>
+            <w:tcMar>
+              <w:top w:type="dxa" w:w="60"/>
+              <w:left w:type="dxa" w:w="100"/>
+              <w:bottom w:type="dxa" w:w="60"/>
+              <w:right w:type="dxa" w:w="100"/>
+            </w:tcMar>
+          </w:tcPr>
+          <w:p>
+            <w:r>
+              <w:rPr>
+                <w:rFonts w:ascii="Arial" w:cs="Arial" w:eastAsia="Arial" w:hAnsi="Arial"/>
+                <w:sz w:val="20"/>
+                <w:szCs w:val="20"/>
+              </w:rPr>
+              <w:t xml:space="preserve">Want to publish without running tests</w:t>
+            </w:r>
+          </w:p>
+        </w:tc>
+        <w:tc>
+          <w:tcPr>
+            <w:tcW w:type="dxa" w:w="5160"/>
+            <w:tcBorders>
+              <w:top w:val="single" w:color="CCCCCC" w:sz="1"/>
+              <w:left w:val="single" w:color="CCCCCC" w:sz="1"/>
+              <w:bottom w:val="single" w:color="CCCCCC" w:sz="1"/>
+              <w:right w:val="single" w:color="CCCCCC" w:sz="1"/>
+            </w:tcBorders>
+            <w:shd w:fill="FFF2CC" w:val="clear"/>
+            <w:tcMar>
+              <w:top w:type="dxa" w:w="60"/>
+              <w:left w:type="dxa" w:w="100"/>
+              <w:bottom w:type="dxa" w:w="60"/>
+              <w:right w:type="dxa" w:w="100"/>
+            </w:tcMar>
+          </w:tcPr>
+          <w:p>
+            <w:r>
+              <w:rPr>
+                <w:rFonts w:ascii="Arial" w:cs="Arial" w:eastAsia="Arial" w:hAnsi="Arial"/>
+                <w:sz w:val="20"/>
+                <w:szCs w:val="20"/>
+              </w:rPr>
+              <w:t xml:space="preserve">Use manual fallback: python scripts/publish_pact.py</w:t>
+            </w:r>
+          </w:p>
+        </w:tc>
+      </w:tr>
     </w:tbl>
     <w:p>
       <w:pPr>
@@ -6554,7 +6605,7 @@
         </w:rPr>
         <w:t xml:space="preserve">GitHub: </w:t>
       </w:r>
-      <w:hyperlink w:history="1" r:id="rIdyf4d_j3zet3i5dpr6pz4p">
+      <w:hyperlink w:history="1" r:id="rIdteqhxxtfps01qhb1jf_m8">
         <w:r>
           <w:rPr>
             <w:rStyle w:val="Hyperlink"/>

</xml_diff>